<commit_message>
Updated Secure Development secondary document (corrected TLS reference)
</commit_message>
<xml_diff>
--- a/source/reference_documents/secondary_documents/implementation phase/Secure Development/Secure Development.docx
+++ b/source/reference_documents/secondary_documents/implementation phase/Secure Development/Secure Development.docx
@@ -29,7 +29,7 @@
         <w:t xml:space="preserve">Version </w:t>
       </w:r>
       <w:r>
-        <w:t>9</w:t>
+        <w:t>10</w:t>
       </w:r>
     </w:p>
     <w:p>
@@ -46,7 +46,7 @@
         <w:rPr>
           <w:noProof/>
         </w:rPr>
-        <w:t>4/11/25 1:07 PM</w:t>
+        <w:t>7/2/26 8:15 AM</w:t>
       </w:r>
       <w:r>
         <w:fldChar w:fldCharType="end"/>
@@ -149,45 +149,7 @@
         <w:t xml:space="preserve"> </w:t>
       </w:r>
       <w:r>
-        <w:t xml:space="preserve">in the development of safety-critical, cyber-physical systems for certification of compliance to standards such as </w:t>
-      </w:r>
-      <w:r>
-        <w:rPr>
-          <w:b/>
-          <w:bCs/>
-        </w:rPr>
-        <w:t>ISO</w:t>
-      </w:r>
-      <w:r>
-        <w:rPr>
-          <w:b/>
-          <w:bCs/>
-        </w:rPr>
-        <w:t>/SAE</w:t>
-      </w:r>
-      <w:r>
-        <w:rPr>
-          <w:b/>
-          <w:bCs/>
-        </w:rPr>
-        <w:t xml:space="preserve"> 21434</w:t>
-      </w:r>
-      <w:r>
-        <w:t xml:space="preserve"> and </w:t>
-      </w:r>
-      <w:r>
-        <w:rPr>
-          <w:b/>
-          <w:bCs/>
-        </w:rPr>
-        <w:t xml:space="preserve">ISO </w:t>
-      </w:r>
-      <w:r>
-        <w:rPr>
-          <w:b/>
-          <w:bCs/>
-        </w:rPr>
-        <w:t>26262</w:t>
+        <w:t>in the development of safety-critical, cyber-physical systems</w:t>
       </w:r>
       <w:r>
         <w:t>.</w:t>
@@ -195,12 +157,100 @@
     </w:p>
     <w:p>
       <w:pPr>
-        <w:pStyle w:val="Heading1"/>
-        <w:jc w:val="both"/>
+        <w:jc w:val="both"/>
+      </w:pPr>
+    </w:p>
+    <w:p>
+      <w:pPr>
+        <w:pStyle w:val="Note"/>
       </w:pPr>
       <w:bookmarkStart w:id="3" w:name="_f5diy2ktdyyf" w:colFirst="0" w:colLast="0"/>
       <w:bookmarkEnd w:id="3"/>
       <w:r>
+        <w:rPr>
+          <w:b/>
+          <w:bCs/>
+          <w:color w:val="0070C0"/>
+        </w:rPr>
+        <w:t>Note:</w:t>
+      </w:r>
+      <w:r>
+        <w:tab/>
+        <w:t xml:space="preserve">Within the </w:t>
+      </w:r>
+      <w:r>
+        <w:t>context</w:t>
+      </w:r>
+      <w:r>
+        <w:t xml:space="preserve"> of this document, the terms </w:t>
+      </w:r>
+      <w:r>
+        <w:rPr>
+          <w:b/>
+          <w:bCs/>
+          <w:i/>
+          <w:iCs/>
+        </w:rPr>
+        <w:t>security</w:t>
+      </w:r>
+      <w:r>
+        <w:t xml:space="preserve"> and </w:t>
+      </w:r>
+      <w:r>
+        <w:rPr>
+          <w:b/>
+          <w:bCs/>
+          <w:i/>
+          <w:iCs/>
+        </w:rPr>
+        <w:t>cybersecurity</w:t>
+      </w:r>
+      <w:r>
+        <w:t xml:space="preserve"> are used interchangeably. It is presumed that the term </w:t>
+      </w:r>
+      <w:r>
+        <w:rPr>
+          <w:b/>
+          <w:bCs/>
+          <w:i/>
+          <w:iCs/>
+        </w:rPr>
+        <w:t>security</w:t>
+      </w:r>
+      <w:r>
+        <w:t xml:space="preserve"> is being used in reference to </w:t>
+      </w:r>
+      <w:r>
+        <w:rPr>
+          <w:b/>
+          <w:bCs/>
+          <w:i/>
+          <w:iCs/>
+        </w:rPr>
+        <w:t>cybersecurity</w:t>
+      </w:r>
+      <w:r>
+        <w:t xml:space="preserve"> and not </w:t>
+      </w:r>
+      <w:r>
+        <w:rPr>
+          <w:b/>
+          <w:bCs/>
+          <w:i/>
+          <w:iCs/>
+        </w:rPr>
+        <w:t>physical security</w:t>
+      </w:r>
+      <w:r>
+        <w:t>.</w:t>
+      </w:r>
+    </w:p>
+    <w:p>
+      <w:pPr>
+        <w:pStyle w:val="Heading1"/>
+        <w:jc w:val="both"/>
+      </w:pPr>
+      <w:r>
         <w:t>License</w:t>
       </w:r>
     </w:p>
@@ -218,7 +268,19 @@
         <w:rPr>
           <w:lang w:val="en-US"/>
         </w:rPr>
-        <w:t xml:space="preserve">was created by </w:t>
+        <w:t xml:space="preserve">was </w:t>
+      </w:r>
+      <w:r>
+        <w:rPr>
+          <w:lang w:val="en-US"/>
+        </w:rPr>
+        <w:t xml:space="preserve">originally </w:t>
+      </w:r>
+      <w:r>
+        <w:rPr>
+          <w:lang w:val="en-US"/>
+        </w:rPr>
+        <w:t xml:space="preserve">created by </w:t>
       </w:r>
       <w:r>
         <w:rPr>
@@ -676,6 +738,7 @@
         <w:pStyle w:val="Heading1"/>
       </w:pPr>
       <w:r>
+        <w:lastRenderedPageBreak/>
         <w:t>Practices</w:t>
       </w:r>
     </w:p>
@@ -2022,7 +2085,7 @@
           <w:b/>
           <w:bCs/>
         </w:rPr>
-        <w:t>RFC 5246</w:t>
+        <w:t>The Transport Layer Security (TLS) Protocol Version 1.3</w:t>
       </w:r>
       <w:r>
         <w:rPr>
@@ -2041,9 +2104,12 @@
             <w:sz w:val="20"/>
             <w:szCs w:val="20"/>
           </w:rPr>
-          <w:t>https://www.rfc-editor.org/rfc/pdfrfc/rfc5246.txt.pdf</w:t>
+          <w:t>https://datatracker.ietf.org/doc/html/rfc8446</w:t>
         </w:r>
       </w:hyperlink>
+      <w:r>
+        <w:t xml:space="preserve"> </w:t>
+      </w:r>
       <w:r>
         <w:rPr>
           <w:rFonts w:ascii="Courier New" w:hAnsi="Courier New" w:cs="Courier New"/>
@@ -3548,6 +3614,21 @@
       <w:u w:val="single"/>
     </w:rPr>
   </w:style>
+  <w:style w:type="paragraph" w:customStyle="1" w:styleId="Note">
+    <w:name w:val="Note"/>
+    <w:basedOn w:val="Normal"/>
+    <w:qFormat/>
+    <w:rsid w:val="001A6267"/>
+    <w:pPr>
+      <w:spacing w:after="240"/>
+      <w:ind w:left="806" w:hanging="806"/>
+      <w:jc w:val="both"/>
+    </w:pPr>
+    <w:rPr>
+      <w:rFonts w:eastAsia="Times New Roman"/>
+      <w:lang w:val="en-US"/>
+    </w:rPr>
+  </w:style>
 </w:styles>
 </file>
 

</xml_diff>